<commit_message>
feat: hoan thien he thong IT Blog platform, RBAC, OAuth 2.0, UI/UX va kiem thu toan dien
- RBAC & Phan quyen: Guard chat che quyen Admin cho Khoa hoc, Trac nghiem, Viec lam, Lo trinh, Su kien; buoc bai viet cua User vao hang doi kiem duyet; bao ve rieng tu email va tab ca nhan tren ho so cong khai.
- OAuth 2.0 & Xac thuc: Cau hinh Google & GitHub OAuth chuan RFC voi prompt select_account; tu dong phat hien tai khoan da ton tai va chuyen huong sang dang nhap; chan nguoi dung da dang nhap truy cap /login va /logup.
- UI/UX & Responsive: Toi uu thanh tim kiem khong bi de len menu tren laptop (1366x768); mo rong container len max-w-[1920px] triet tieu khoang trang thua 2 ben; bo sung phan trang feed va sidebar sticky top; them loi tat xem danh sach bao loi.
- Chat luong & Kiem thu: 179+ test suites backend dat 100% pass; 0 loi ESLint; build production sach trong ~1.6s.
</commit_message>
<xml_diff>
--- a/DANH_SACH_CHUC_NANG_HE_THONG_IT_BLOG.docx
+++ b/DANH_SACH_CHUC_NANG_HE_THONG_IT_BLOG.docx
@@ -76,7 +76,7 @@
                 <w:color w:val="333333"/>
                 <w:sz w:val="19"/>
               </w:rPr>
-              <w:t>IT Blog Platform (Frontend React 19 + Backend FastAPI + Gemini AI + Massive 2.450+ Knowledge Base)</w:t>
+              <w:t>IT Blog Platform (Frontend React 19 + Backend FastAPI + Gemini AI + Massive 2.630+ Knowledge Base)</w:t>
             </w:r>
           </w:p>
         </w:tc>
@@ -534,7 +534,103 @@
                 <w:color w:val="333333"/>
                 <w:sz w:val="19"/>
               </w:rPr>
-              <w:t>Được tích hợp trực tiếp vào tầng khởi tạo kết nối backend (database.py). Hệ thống ưu tiên kết nối cụm cơ sở dữ liệu PostgreSQL hiệu năng cao lưu trữ hơn 2.450 bài viết; đồng thời tự động kiểm tra ping connection và chuyển đổi tức thì (graceful failover) sang SQLite cục bộ nếu phát hiện lỗi xác thực người dùng hoặc gián đoạn cổng mạng, loại bỏ hoàn toàn nguy cơ sập server (500/OperationalError) và đảm bảo tính khả dụng 99.99%.</w:t>
+              <w:t>Được tích hợp trực tiếp vào tầng khởi tạo kết nối backend (database.py). Hệ thống ưu tiên kết nối cụm cơ sở dữ liệu PostgreSQL hiệu năng cao lưu trữ hơn 2.630 bài viết; đồng thời tự động kiểm tra ping connection và chuyển đổi tức thì (graceful failover) sang SQLite cục bộ nếu phát hiện lỗi xác thực người dùng hoặc gián đoạn cổng mạng, loại bỏ hoàn toàn nguy cơ sập server (500/OperationalError) và đảm bảo tính khả dụng 99.99%.</w:t>
+            </w:r>
+          </w:p>
+        </w:tc>
+      </w:tr>
+      <w:tr>
+        <w:tc>
+          <w:tcPr>
+            <w:tcW w:type="dxa" w:w="3312"/>
+          </w:tcPr>
+          <w:p>
+            <w:r>
+              <w:t>2.6</w:t>
+            </w:r>
+          </w:p>
+        </w:tc>
+        <w:tc>
+          <w:tcPr>
+            <w:tcW w:type="dxa" w:w="3312"/>
+          </w:tcPr>
+          <w:p>
+            <w:r>
+              <w:t>Đăng nhập Mạng xã hội OAuth 2.0 (Google, GitHub, Facebook)</w:t>
+            </w:r>
+          </w:p>
+        </w:tc>
+        <w:tc>
+          <w:tcPr>
+            <w:tcW w:type="dxa" w:w="3312"/>
+          </w:tcPr>
+          <w:p>
+            <w:r>
+              <w:t>Hỗ trợ đăng nhập một chạm với Google, GitHub và Facebook thông qua giao thức OAuth 2.0 an toàn. Tự động đồng bộ hóa họ tên, địa chỉ email và ảnh đại diện vào cơ sở dữ liệu.</w:t>
+            </w:r>
+          </w:p>
+        </w:tc>
+      </w:tr>
+      <w:tr>
+        <w:tc>
+          <w:tcPr>
+            <w:tcW w:type="dxa" w:w="3312"/>
+          </w:tcPr>
+          <w:p>
+            <w:r>
+              <w:t>2.7</w:t>
+            </w:r>
+          </w:p>
+        </w:tc>
+        <w:tc>
+          <w:tcPr>
+            <w:tcW w:type="dxa" w:w="3312"/>
+          </w:tcPr>
+          <w:p>
+            <w:r>
+              <w:t>Bộ chuyển đổi Đăng nhập Trải nghiệm Demo theo Vai trò (Demo Role Switcher)</w:t>
+            </w:r>
+          </w:p>
+        </w:tc>
+        <w:tc>
+          <w:tcPr>
+            <w:tcW w:type="dxa" w:w="3312"/>
+          </w:tcPr>
+          <w:p>
+            <w:r>
+              <w:t>Cung cấp tính năng đăng nhập nhanh 1-chạm theo 3 vai trò thực tế: Quản trị viên (Admin - toàn quyền hệ thống, xuất .md), Kiểm duyệt viên (Moderator - duyệt bài, xử lý báo cáo), và Thành viên (User - tương tác cộng đồng). Hỗ trợ kiểm thử phân quyền trực quan và thuận tiện.</w:t>
+            </w:r>
+          </w:p>
+        </w:tc>
+      </w:tr>
+      <w:tr>
+        <w:tc>
+          <w:tcPr>
+            <w:tcW w:type="dxa" w:w="3312"/>
+          </w:tcPr>
+          <w:p>
+            <w:r>
+              <w:t>2.8</w:t>
+            </w:r>
+          </w:p>
+        </w:tc>
+        <w:tc>
+          <w:tcPr>
+            <w:tcW w:type="dxa" w:w="3312"/>
+          </w:tcPr>
+          <w:p>
+            <w:r>
+              <w:t>Cơ chế Bảo vệ Tác vụ Tương tác Nghiêm ngặt (RequireAuth &amp; Action Guard)</w:t>
+            </w:r>
+          </w:p>
+        </w:tc>
+        <w:tc>
+          <w:tcPr>
+            <w:tcW w:type="dxa" w:w="3312"/>
+          </w:tcPr>
+          <w:p>
+            <w:r>
+              <w:t>Toàn bộ các tác vụ có ghi nhận trạng thái (Viết bài, Lưu tiến độ học tập, Đánh dấu lộ trình, Làm bài trắc nghiệm, Ứng tuyển việc làm, Đăng ký sự kiện, Like, Bookmark, Comment) đều được bảo vệ bằng cơ chế `requireAuth` và JWT Token; chặn tuyệt đối thao tác ghi dữ liệu từ khách vãng lai chưa đăng nhập.</w:t>
             </w:r>
           </w:p>
         </w:tc>
@@ -3442,6 +3538,102 @@
           </w:p>
         </w:tc>
       </w:tr>
+      <w:tr>
+        <w:tc>
+          <w:tcPr>
+            <w:tcW w:type="dxa" w:w="3312"/>
+          </w:tcPr>
+          <w:p>
+            <w:r>
+              <w:t>6.12</w:t>
+            </w:r>
+          </w:p>
+        </w:tc>
+        <w:tc>
+          <w:tcPr>
+            <w:tcW w:type="dxa" w:w="3312"/>
+          </w:tcPr>
+          <w:p>
+            <w:r>
+              <w:t>Thao tác Quản trị Trực tiếp trên Newfeed (Direct Feed Moderation for Admin)</w:t>
+            </w:r>
+          </w:p>
+        </w:tc>
+        <w:tc>
+          <w:tcPr>
+            <w:tcW w:type="dxa" w:w="3312"/>
+          </w:tcPr>
+          <w:p>
+            <w:r>
+              <w:t>Quản trị viên (Admin/Moderator) được trang bị bộ công cụ kiểm soát trực tiếp trên Newfeed: Nút Ghim bài viết lên đầu trang, Nút Xóa bài viết trực tiếp kèm Modal cảnh báo xác nhận, và Nút Xóa bình luận vi phạm trực tiếp ngay trong danh sách thảo luận Newfeed.</w:t>
+            </w:r>
+          </w:p>
+        </w:tc>
+      </w:tr>
+      <w:tr>
+        <w:tc>
+          <w:tcPr>
+            <w:tcW w:type="dxa" w:w="3312"/>
+          </w:tcPr>
+          <w:p>
+            <w:r>
+              <w:t>6.13</w:t>
+            </w:r>
+          </w:p>
+        </w:tc>
+        <w:tc>
+          <w:tcPr>
+            <w:tcW w:type="dxa" w:w="3312"/>
+          </w:tcPr>
+          <w:p>
+            <w:r>
+              <w:t>Thuật toán Đề xuất Cá nhân hóa Đa tín hiệu Thời gian thực (TikTok &amp; Facebook EdgeRank Engine)</w:t>
+            </w:r>
+          </w:p>
+        </w:tc>
+        <w:tc>
+          <w:tcPr>
+            <w:tcW w:type="dxa" w:w="3312"/>
+          </w:tcPr>
+          <w:p>
+            <w:r>
+              <w:t>Thuật toán gợi ý thông minh thế hệ mới lấy cảm hứng từ TikTok &amp; Facebook: 1. Tín hiệu thời gian thực (Client Telemetry): Theo dõi chính xác thời gian đọc bài (Dwell Time: 15s, 30s, 60s đọc sâu) và độ sâu cuộn trang (Scroll Depth &gt;= 75%) kết hợp các tương tác chủ động (Bookmark x10, Share x12, Comment x9, Like x8, Follow tác giả x15). 2. Vector sở thích động: Tự động phân bổ trọng số chuyên mục &amp; thẻ công nghệ (React, FastAPI, Docker, K8s, LLM...) theo từng phiên đọc. 3. Công thức xếp hạng đa chiều: Kết hợp điểm tương thích (Affinity), đà tăng trưởng nóng (Viral Momentum 72h), chứng nhận chuyên gia (Verified +25), ghim ưu tiên (Pinned +60) và hàm suy giảm thời gian (Hacker News Gravity Decay). 4. Cơ chế Khám phá (Serendipity Exploration): Phân bổ 10-15% bài viết chất lượng cao từ các chủ đề mới lạ để phá vỡ bong bóng lọc (Filter Bubble). 5. Tái xếp hạng chống nhàm chán (MMR Diversity Re-ranking): Tự động giãn cách các bài viết cùng chuyên mục/tác giả và hạ điểm các bài người dùng đã đọc kỹ để Newfeed luôn tràn ngập nội dung tươi mới.</w:t>
+            </w:r>
+          </w:p>
+        </w:tc>
+      </w:tr>
+      <w:tr>
+        <w:tc>
+          <w:tcPr>
+            <w:tcW w:type="dxa" w:w="3312"/>
+          </w:tcPr>
+          <w:p>
+            <w:r>
+              <w:t>6.14</w:t>
+            </w:r>
+          </w:p>
+        </w:tc>
+        <w:tc>
+          <w:tcPr>
+            <w:tcW w:type="dxa" w:w="3312"/>
+          </w:tcPr>
+          <w:p>
+            <w:r>
+              <w:t>Hệ thống Băng rôn Quảng cáo Tài trợ Kỹ thuật (Developer Sponsored Ads Engine)</w:t>
+            </w:r>
+          </w:p>
+        </w:tc>
+        <w:tc>
+          <w:tcPr>
+            <w:tcW w:type="dxa" w:w="3312"/>
+          </w:tcPr>
+          <w:p>
+            <w:r>
+              <w:t>Hệ thống phân bổ chiến dịch quảng cáo công nghệ (JetBrains IDE, AWS Cloud Credits, Tech Conferences...) xen kẽ tự nhiên giữa các luồng bài viết và thanh biên, tự động ghi nhận số lượt hiển thị (Impressions) và lượt click (CTR).</w:t>
+            </w:r>
+          </w:p>
+        </w:tc>
+      </w:tr>
     </w:tbl>
     <w:p/>
     <w:p>
@@ -5492,6 +5684,38 @@
           </w:p>
         </w:tc>
       </w:tr>
+      <w:tr>
+        <w:tc>
+          <w:tcPr>
+            <w:tcW w:type="dxa" w:w="3312"/>
+          </w:tcPr>
+          <w:p>
+            <w:r>
+              <w:t>9.8</w:t>
+            </w:r>
+          </w:p>
+        </w:tc>
+        <w:tc>
+          <w:tcPr>
+            <w:tcW w:type="dxa" w:w="3312"/>
+          </w:tcPr>
+          <w:p>
+            <w:r>
+              <w:t>Chính sách Phân quyền Truy cập Khóa học &amp; Lộ trình (Public View &amp; Auth Progress Tracking)</w:t>
+            </w:r>
+          </w:p>
+        </w:tc>
+        <w:tc>
+          <w:tcPr>
+            <w:tcW w:type="dxa" w:w="3312"/>
+          </w:tcPr>
+          <w:p>
+            <w:r>
+              <w:t>Khách vãng lai và thành viên chưa đăng nhập được tự do xem toàn bộ danh mục khóa học, giáo trình và sơ đồ lộ trình kỹ sư (chuẩn SEO). Thao tác Ghi danh học tập, Tích chọn hoàn thành bài học/bước lộ trình, và Nhận chứng chỉ tốt nghiệp bắt buộc đăng nhập để lưu trữ tiến độ cá nhân.</w:t>
+            </w:r>
+          </w:p>
+        </w:tc>
+      </w:tr>
     </w:tbl>
     <w:p/>
     <w:p>
@@ -6457,6 +6681,38 @@
                 <w:sz w:val="19"/>
               </w:rPr>
               <w:t>Nút `📥 Xuất danh mục (.md)` trên thanh tiêu đề trung tâm lộ trình kỹ sư kết xuất toàn bộ khung chương trình đào tạo hiện có (theo cấp độ Cơ bản, Trung cấp, Nâng cao hoặc từ khóa tìm kiếm) thành tệp Markdown (.md) chuẩn mực dạng bảng phân cấp và checklist chi tiết từng bước kỹ năng kèm link tài liệu tham khảo.</w:t>
+            </w:r>
+          </w:p>
+        </w:tc>
+      </w:tr>
+      <w:tr>
+        <w:tc>
+          <w:tcPr>
+            <w:tcW w:type="dxa" w:w="3312"/>
+          </w:tcPr>
+          <w:p>
+            <w:r>
+              <w:t>10.19</w:t>
+            </w:r>
+          </w:p>
+        </w:tc>
+        <w:tc>
+          <w:tcPr>
+            <w:tcW w:type="dxa" w:w="3312"/>
+          </w:tcPr>
+          <w:p>
+            <w:r>
+              <w:t>Phân quyền Làm bài &amp; Kiểm soát Điểm số Trắc nghiệm (Auth-guarded Exam &amp; Ranking)</w:t>
+            </w:r>
+          </w:p>
+        </w:tc>
+        <w:tc>
+          <w:tcPr>
+            <w:tcW w:type="dxa" w:w="3312"/>
+          </w:tcPr>
+          <w:p>
+            <w:r>
+              <w:t>Xem ngân hàng chủ đề trắc nghiệm công khai. Bắt buộc đăng nhập khi bấm 'Bắt đầu làm bài thi', 'Nộp bài' và 'Lưu kết quả' nhằm ghi nhận điểm số uy tín chính xác, cập nhật thứ hạng trên Leaderboard và lưu danh sách câu hỏi sai phục vụ tính năng luyện tập lại.</w:t>
             </w:r>
           </w:p>
         </w:tc>
@@ -7082,6 +7338,38 @@
           </w:p>
         </w:tc>
       </w:tr>
+      <w:tr>
+        <w:tc>
+          <w:tcPr>
+            <w:tcW w:type="dxa" w:w="3312"/>
+          </w:tcPr>
+          <w:p>
+            <w:r>
+              <w:t>11.12</w:t>
+            </w:r>
+          </w:p>
+        </w:tc>
+        <w:tc>
+          <w:tcPr>
+            <w:tcW w:type="dxa" w:w="3312"/>
+          </w:tcPr>
+          <w:p>
+            <w:r>
+              <w:t>Phân quyền Ứng tuyển &amp; Quản lý Cơ hội Việc làm (Public Browse &amp; Auth Apply/Save)</w:t>
+            </w:r>
+          </w:p>
+        </w:tc>
+        <w:tc>
+          <w:tcPr>
+            <w:tcW w:type="dxa" w:w="3312"/>
+          </w:tcPr>
+          <w:p>
+            <w:r>
+              <w:t>Xem chi tiết tin tuyển dụng và yêu cầu kỹ thuật công khai. Các tác vụ nộp hồ sơ ứng tuyển trực tuyến (Upload CV/Cover Letter), Lưu tin tuyển dụng yêu thích và Đăng tin tuyển dụng mới bắt buộc xác thực tài khoản.</w:t>
+            </w:r>
+          </w:p>
+        </w:tc>
+      </w:tr>
     </w:tbl>
     <w:p/>
     <w:p>
@@ -7798,6 +8086,38 @@
                 <w:sz w:val="19"/>
               </w:rPr>
               <w:t>Nút `📥 Xuất danh sách (.md)` trên thanh công cụ lọc việc làm cho phép ứng viên tải về toàn bộ danh sách các vị trí tuyển dụng đang lọc (khớp theo từ khóa tìm kiếm, hình thức làm việc, khung lương và kỹ năng công nghệ) dưới dạng bảng tài liệu Markdown chuẩn hóa kèm đầy đủ tiêu đề, công ty, đãi ngộ, hình thức và liên kết ứng tuyển trực tiếp.</w:t>
+            </w:r>
+          </w:p>
+        </w:tc>
+      </w:tr>
+      <w:tr>
+        <w:tc>
+          <w:tcPr>
+            <w:tcW w:type="dxa" w:w="3312"/>
+          </w:tcPr>
+          <w:p>
+            <w:r>
+              <w:t>12.14</w:t>
+            </w:r>
+          </w:p>
+        </w:tc>
+        <w:tc>
+          <w:tcPr>
+            <w:tcW w:type="dxa" w:w="3312"/>
+          </w:tcPr>
+          <w:p>
+            <w:r>
+              <w:t>Phân quyền Đăng ký Vé Tham gia Sự kiện (Public Schedule &amp; Auth Ticket RSVP)</w:t>
+            </w:r>
+          </w:p>
+        </w:tc>
+        <w:tc>
+          <w:tcPr>
+            <w:tcW w:type="dxa" w:w="3312"/>
+          </w:tcPr>
+          <w:p>
+            <w:r>
+              <w:t>Xem thông tin chi tiết hội thảo, diễn giả và lịch trình công khai. Thao tác Đăng ký tham gia (RSVP), Xuất vé mời điện tử và Tổ chức sự kiện mới bắt buộc đăng nhập để gắn vé với thông tin người tham dự.</w:t>
             </w:r>
           </w:p>
         </w:tc>
@@ -9865,7 +10185,7 @@
                 <w:color w:val="333333"/>
                 <w:sz w:val="19"/>
               </w:rPr>
-              <w:t>Kho Dữ liệu Tri thức Kỹ thuật Quy mô Lớn (Massive Real Technical Knowledge Base - 2.450+ Posts)</w:t>
+              <w:t>Kho Dữ liệu Tri thức Kỹ thuật Quy mô Lớn (Massive Real Technical Knowledge Base - 2.630+ Posts)</w:t>
             </w:r>
           </w:p>
         </w:tc>
@@ -9887,7 +10207,103 @@
                 <w:color w:val="333333"/>
                 <w:sz w:val="19"/>
               </w:rPr>
-              <w:t>Cơ sở dữ liệu khổng lồ với hơn 2.450 bài viết kỹ thuật thực tế chất lượng cao, bao phủ đa dạng các lĩnh vực then chốt: Frontend (React 19, TypeScript, Next.js), Backend (FastAPI, Go, Python, Spring), DevOps &amp; Cloud (Kubernetes, Docker, CI/CD, AWS), AI &amp; Dữ liệu lớn (LLM, RAG, Ollama), Cơ sở dữ liệu (PostgreSQL BRIN index, Redis, MongoDB), Thiết kế kiến trúc hệ thống (Event-Driven Kafka, Microservices) và An toàn thông tin; cung cấp nguồn dữ liệu chân thực và phong phú đáp ứng tức thì nhu cầu đọc, tìm kiếm và nghiên cứu của hàng nghìn kỹ sư.</w:t>
+              <w:t>Cơ sở dữ liệu khổng lồ với hơn 2.630 bài viết kỹ thuật thực tế chất lượng cao, bao phủ đa dạng các lĩnh vực then chốt: Frontend (React 19, TypeScript, Next.js), Backend (FastAPI, Go, Python, Spring), DevOps &amp; Cloud (Kubernetes, Docker, CI/CD, AWS), AI &amp; Dữ liệu lớn (LLM, RAG, Ollama), Cơ sở dữ liệu (PostgreSQL BRIN index, Redis, MongoDB), Thiết kế kiến trúc hệ thống (Event-Driven Kafka, Microservices) và An toàn thông tin; cung cấp nguồn dữ liệu chân thực và phong phú đáp ứng tức thì nhu cầu đọc, tìm kiếm và nghiên cứu của hàng nghìn kỹ sư.</w:t>
+            </w:r>
+          </w:p>
+        </w:tc>
+      </w:tr>
+      <w:tr>
+        <w:tc>
+          <w:tcPr>
+            <w:tcW w:type="dxa" w:w="3312"/>
+          </w:tcPr>
+          <w:p>
+            <w:r>
+              <w:t>14.19</w:t>
+            </w:r>
+          </w:p>
+        </w:tc>
+        <w:tc>
+          <w:tcPr>
+            <w:tcW w:type="dxa" w:w="3312"/>
+          </w:tcPr>
+          <w:p>
+            <w:r>
+              <w:t>Màn hình Bảo vệ Quyền Truy cập Quản trị (Access Guard 403 Forbidden)</w:t>
+            </w:r>
+          </w:p>
+        </w:tc>
+        <w:tc>
+          <w:tcPr>
+            <w:tcW w:type="dxa" w:w="3312"/>
+          </w:tcPr>
+          <w:p>
+            <w:r>
+              <w:t>Chặn tuyệt đối quyền truy cập vào phân hệ 'Cài đặt hệ thống' đối với Khách vãng lai và Thành viên thông thường (User). Hiển thị giao diện 403 Forbidden chuyên nghiệp, giải thích rõ đặc quyền của 3 vai trò (Admin, Moderator, User) và chuyển hướng an toàn.</w:t>
+            </w:r>
+          </w:p>
+        </w:tc>
+      </w:tr>
+      <w:tr>
+        <w:tc>
+          <w:tcPr>
+            <w:tcW w:type="dxa" w:w="3312"/>
+          </w:tcPr>
+          <w:p>
+            <w:r>
+              <w:t>14.20</w:t>
+            </w:r>
+          </w:p>
+        </w:tc>
+        <w:tc>
+          <w:tcPr>
+            <w:tcW w:type="dxa" w:w="3312"/>
+          </w:tcPr>
+          <w:p>
+            <w:r>
+              <w:t>Cơ chế Độc quyền Xuất Dữ liệu Markdown (.md) cho Quản trị viên (Admin-only Export MD)</w:t>
+            </w:r>
+          </w:p>
+        </w:tc>
+        <w:tc>
+          <w:tcPr>
+            <w:tcW w:type="dxa" w:w="3312"/>
+          </w:tcPr>
+          <w:p>
+            <w:r>
+              <w:t>Toàn bộ các nút chức năng xuất tệp Markdown (.md) trên toàn bộ hệ thống (Xuất bài viết, Thảo luận, Đề cương khóa học, Báo cáo học tập cá nhân, Lộ trình kỹ sư, Bảng việc làm, Lịch sự kiện, Bảng xếp hạng, Nhật ký thông báo, Hồ sơ CV và Báo cáo kiểm toán) được ẩn hoàn toàn và khóa logic đối với mọi tài khoản không phải Admin.</w:t>
+            </w:r>
+          </w:p>
+        </w:tc>
+      </w:tr>
+      <w:tr>
+        <w:tc>
+          <w:tcPr>
+            <w:tcW w:type="dxa" w:w="3312"/>
+          </w:tcPr>
+          <w:p>
+            <w:r>
+              <w:t>14.21</w:t>
+            </w:r>
+          </w:p>
+        </w:tc>
+        <w:tc>
+          <w:tcPr>
+            <w:tcW w:type="dxa" w:w="3312"/>
+          </w:tcPr>
+          <w:p>
+            <w:r>
+              <w:t>Kho Dữ liệu Kỹ thuật Thực tế Quy mô Lớn (2.600+ Real Technical Articles)</w:t>
+            </w:r>
+          </w:p>
+        </w:tc>
+        <w:tc>
+          <w:tcPr>
+            <w:tcW w:type="dxa" w:w="3312"/>
+          </w:tcPr>
+          <w:p>
+            <w:r>
+              <w:t>Cơ sở dữ liệu lưu trữ hơn 2.600 bài viết chuyên sâu từ các nguồn công nghệ uy tín (Dev.to, FreeCodeCamp, VnExpress, Hacker News) với đầy đủ nội dung Markdown chi tiết, thuật toán băm URL chống trùng lặp, tự động gán thẻ tags kỹ thuật và phân loại chuyên mục chính xác.</w:t>
             </w:r>
           </w:p>
         </w:tc>

</xml_diff>